<commit_message>
Add Palantir Foundry & AIP Builder Foundations certification to master and Palantir tailored resume
Co-Authored-By: Claude Opus 4.6 (1M context) <noreply@anthropic.com>
</commit_message>
<xml_diff>
--- a/outputs/2026-03-23-aws-platform/Vamshi_Resume_2026_AWS_Palantir.docx
+++ b/outputs/2026-03-23-aws-platform/Vamshi_Resume_2026_AWS_Palantir.docx
@@ -1463,7 +1463,13 @@
         </w:numPr>
       </w:pPr>
       <w:r>
-        <w:t xml:space="preserve">Building Generative AI Applications Using Amazon Bedrock, Agentic AI</w:t>
+        <w:t xml:space="preserve">Foundry &amp; AIP Builder Foundations (Palantir Technologies), Building</w:t>
+      </w:r>
+      <w:r>
+        <w:t xml:space="preserve"> </w:t>
+      </w:r>
+      <w:r>
+        <w:t xml:space="preserve">Generative AI Applications Using Amazon Bedrock, Agentic AI</w:t>
       </w:r>
       <w:r>
         <w:t xml:space="preserve"> </w:t>

</xml_diff>